<commit_message>
feat(auth): implement WeCom avatar and permission controls
</commit_message>
<xml_diff>
--- a/docs/handbook/苏南船舶管理系统操作手册.docx
+++ b/docs/handbook/苏南船舶管理系统操作手册.docx
@@ -372,7 +372,7 @@
                 <w:sz w:val="18"/>
                 <w:szCs w:val="18"/>
               </w:rPr>
-              <w:t xml:space="preserve">2026 年 8 月 5 日</w:t>
+              <w:t xml:space="preserve">2026 年 8 月 10 日</w:t>
             </w:r>
           </w:p>
         </w:tc>
@@ -1574,7 +1574,7 @@
                 <w:sz w:val="18"/>
                 <w:szCs w:val="18"/>
               </w:rPr>
-              <w:t xml:space="preserve">2026 年 8 月 5 日</w:t>
+              <w:t xml:space="preserve">2026 年 8 月 10 日</w:t>
             </w:r>
           </w:p>
         </w:tc>
@@ -18799,7 +18799,7 @@
           <w:sz w:val="21"/>
           <w:szCs w:val="21"/>
         </w:rPr>
-        <w:t xml:space="preserve">管理角色可新增：</w:t>
+        <w:t xml:space="preserve">仅系统管理员可新增：</w:t>
       </w:r>
     </w:p>
     <w:p>
@@ -18901,7 +18901,7 @@
           <w:sz w:val="21"/>
           <w:szCs w:val="21"/>
         </w:rPr>
-        <w:t xml:space="preserve">当前 H5 页面没有编辑或停用按钮。录错地址或需要停用时，联系系统管理员处理。该模块是外部监控入口管理，不等同于系统内置 AIS、CCTV 台账或值班交接。</w:t>
+        <w:t xml:space="preserve">总经办、财务部、业务部、船务部、后勤部及普通成员均不显示新增表单。当前 H5 页面没有编辑或停用按钮；录错地址或需要停用时，由系统管理员通过受权接口处理。该模块是外部监控入口管理，不等同于系统内置 AIS、CCTV 台账或值班交接。</w:t>
       </w:r>
     </w:p>
     <w:p>
@@ -18966,7 +18966,7 @@
           <w:sz w:val="18"/>
           <w:szCs w:val="18"/>
         </w:rPr>
-        <w:t xml:space="preserve">图 5-6 船舶监控。截图应分别标注普通用户“打开”入口和管理角色新增区域。</w:t>
+        <w:t xml:space="preserve">图 5-6 船舶监控。截图应分别标注普通用户“打开”入口和系统管理员新增区域。</w:t>
       </w:r>
     </w:p>
     <w:p>

</xml_diff>